<commit_message>
updated study 2 materials
</commit_message>
<xml_diff>
--- a/method/study 2/organiser/Study 2 Feedback Sheet.docx
+++ b/method/study 2/organiser/Study 2 Feedback Sheet.docx
@@ -37,6 +37,7 @@
           <w:sz w:val="24"/>
           <w:szCs w:val="24"/>
           <w:shd w:val="clear" w:color="auto" w:fill="FFFFFF"/>
+          <w:lang w:val="de-CH"/>
         </w:rPr>
         <w:t xml:space="preserve">Study 2 </w:t>
       </w:r>
@@ -62,7 +63,7 @@
           <w:bCs/>
           <w:sz w:val="24"/>
           <w:szCs w:val="24"/>
-          <w:lang w:val="en-US"/>
+          <w:lang w:val="de-CH"/>
         </w:rPr>
       </w:pPr>
     </w:p>
@@ -83,7 +84,7 @@
           <w:szCs w:val="24"/>
           <w:lang w:val="de-DE"/>
         </w:rPr>
-        <w:t xml:space="preserve">In der Studie, an der Sie gerade teilgenommen haben, wurde untersucht, ob die Unterdrückung eines Gedankens im Vergleich zur Konzentration auf diesen Gedanken dazu führt, dass Menschen unter Zeitdruck den unterdrückten Gedanken häufiger haben. </w:t>
+        <w:t xml:space="preserve">In der Studie, an der Sie gerade teilgenommen haben, wurde untersucht, ob die Unterdrückung eines Gedankens im Vergleich zur Konzentration auf diesen Gedanken dazu führt, dass Menschen den unterdrückten Gedanken häufiger haben. </w:t>
       </w:r>
     </w:p>
     <w:p>
@@ -103,7 +104,88 @@
           <w:szCs w:val="24"/>
           <w:lang w:val="de-DE"/>
         </w:rPr>
-        <w:t xml:space="preserve">Sie wurden zufällig entweder einer Konzentrations- oder einer Unterdrückungsbedingung zugeteilt, indem Ihnen gesagt wurde, dass Sie sich entweder auf einen bestimmten Gedanken konzentrieren sollen oder nicht. Anhand der Computeraufgabe wurde untersucht, ob diejenigen, die den Gedanken unterdrückt hatten unter hohem Zeitdruck eher Antworten gaben, die dem unterdrückten Gedanken entsprachen als diejenigen, die sich auf den Gedanken konzentriert hatten. </w:t>
+        <w:t xml:space="preserve">Sie wurden zufällig entweder einer Konzentrations- oder einer Unterdrückungsbedingung zugeteilt, indem Ihnen gesagt wurde, dass Sie sich </w:t>
+      </w:r>
+      <w:r>
+        <w:rPr>
+          <w:rFonts w:ascii="Times New Roman" w:hAnsi="Times New Roman" w:cs="Times New Roman"/>
+          <w:sz w:val="24"/>
+          <w:szCs w:val="24"/>
+          <w:lang w:val="de-DE"/>
+        </w:rPr>
+        <w:t xml:space="preserve">beim ersten Durchgang </w:t>
+      </w:r>
+      <w:r>
+        <w:rPr>
+          <w:rFonts w:ascii="Times New Roman" w:hAnsi="Times New Roman" w:cs="Times New Roman"/>
+          <w:sz w:val="24"/>
+          <w:szCs w:val="24"/>
+          <w:lang w:val="de-DE"/>
+        </w:rPr>
+        <w:t xml:space="preserve">entweder auf einen bestimmten Gedanken konzentrieren sollen oder nicht. </w:t>
+      </w:r>
+      <w:r>
+        <w:rPr>
+          <w:rFonts w:ascii="Times New Roman" w:hAnsi="Times New Roman" w:cs="Times New Roman"/>
+          <w:sz w:val="24"/>
+          <w:szCs w:val="24"/>
+          <w:lang w:val="de-DE"/>
+        </w:rPr>
+        <w:t xml:space="preserve">Beim zweiten Durchgang sollten Sie sich dann wieder/nun auf diesen Gedanken konzentrieren. </w:t>
+      </w:r>
+      <w:r>
+        <w:rPr>
+          <w:rFonts w:ascii="Times New Roman" w:hAnsi="Times New Roman" w:cs="Times New Roman"/>
+          <w:sz w:val="24"/>
+          <w:szCs w:val="24"/>
+          <w:lang w:val="de-DE"/>
+        </w:rPr>
+        <w:t xml:space="preserve">Anhand </w:t>
+      </w:r>
+      <w:r>
+        <w:rPr>
+          <w:rFonts w:ascii="Times New Roman" w:hAnsi="Times New Roman" w:cs="Times New Roman"/>
+          <w:sz w:val="24"/>
+          <w:szCs w:val="24"/>
+          <w:lang w:val="de-DE"/>
+        </w:rPr>
+        <w:t xml:space="preserve">des Klingelns </w:t>
+      </w:r>
+      <w:r>
+        <w:rPr>
+          <w:rFonts w:ascii="Times New Roman" w:hAnsi="Times New Roman" w:cs="Times New Roman"/>
+          <w:sz w:val="24"/>
+          <w:szCs w:val="24"/>
+          <w:lang w:val="de-DE"/>
+        </w:rPr>
+        <w:t xml:space="preserve">wurde untersucht, ob diejenigen, die den Gedanken </w:t>
+      </w:r>
+      <w:r>
+        <w:rPr>
+          <w:rFonts w:ascii="Times New Roman" w:hAnsi="Times New Roman" w:cs="Times New Roman"/>
+          <w:sz w:val="24"/>
+          <w:szCs w:val="24"/>
+          <w:lang w:val="de-DE"/>
+        </w:rPr>
+        <w:t xml:space="preserve">beim ersten Durchgang </w:t>
+      </w:r>
+      <w:r>
+        <w:rPr>
+          <w:rFonts w:ascii="Times New Roman" w:hAnsi="Times New Roman" w:cs="Times New Roman"/>
+          <w:sz w:val="24"/>
+          <w:szCs w:val="24"/>
+          <w:lang w:val="de-DE"/>
+        </w:rPr>
+        <w:t xml:space="preserve">unterdrückt hatten </w:t>
+      </w:r>
+      <w:r>
+        <w:rPr>
+          <w:rFonts w:ascii="Times New Roman" w:hAnsi="Times New Roman" w:cs="Times New Roman"/>
+          <w:sz w:val="24"/>
+          <w:szCs w:val="24"/>
+          <w:lang w:val="de-DE"/>
+        </w:rPr>
+        <w:t>beim zweiten Durchgang öfters an das Wort dachten</w:t>
       </w:r>
     </w:p>
     <w:p>

</xml_diff>